<commit_message>
PDF to Word: recover colons and slashes ML Kit drops; align the grey band
From the v1.0.11 phone output (kept as a fixture):
- Lone ":" and "/" that ML Kit doesn't return are read from the ink (two
  stacked dots on the local baseline; a straight rising stroke, alone or
  joined to the next letter, e.g. "FacWing:" -> "Fac/Wing:"), listed for
  review, never doubled where OCR read another mark.
- The shaded band's edges snap to the table / text column below it.
- The unread search accepts narrow marks and ignores broken vertical
  cell borders; table marks still unread are reported and listed.
- Test: an ML Kit-like OCR variant requiring the colons, slashes and
  band alignment.

Co-Authored-By: Claude Opus 5.5 <noreply@anthropic.com>
Claude-Session: https://claude.ai/code/session_011eHvrgr4qBP8gBZJFXR5Zk
</commit_message>
<xml_diff>
--- a/test/fixtures/mess_bill/report/edit_check/edited.docx
+++ b/test/fixtures/mess_bill/report/edit_check/edited.docx
@@ -433,8 +433,8 @@
     </w:p>
     <w:tbl>
       <w:tblPr>
-        <w:tblW w:w="10567" w:type="dxa"/>
-        <w:tblInd w:w="-63" w:type="dxa"/>
+        <w:tblW w:w="10114" w:type="dxa"/>
+        <w:tblInd w:w="584" w:type="dxa"/>
         <w:tblLayout w:type="fixed"/>
         <w:tblCellMar>
           <w:top w:w="0" w:type="dxa"/>
@@ -444,7 +444,7 @@
         </w:tblCellMar>
       </w:tblPr>
       <w:tblGrid>
-        <w:gridCol w:w="10567"/>
+        <w:gridCol w:w="10114"/>
       </w:tblGrid>
       <w:tr>
         <w:trPr>
@@ -452,16 +452,17 @@
         </w:trPr>
         <w:tc>
           <w:tcPr>
-            <w:tcW w:w="10567" w:type="dxa"/>
+            <w:tcW w:w="10114" w:type="dxa"/>
             <w:shd w:val="clear" w:color="auto" w:fill="D8D5D6"/>
             <w:vAlign w:val="top"/>
           </w:tcPr>
           <w:p>
             <w:pPr>
               <w:spacing w:before="156" w:after="0" w:line="552" w:lineRule="exact"/>
-              <w:ind w:left="1439" w:right="0"/>
+              <w:ind w:left="0" w:right="134"/>
+              <w:jc w:val="center"/>
             </w:pPr>
-            <w:bookmarkStart w:id="5" w:name="_OCR_5"/>
+            <w:bookmarkStart w:id="7" w:name="_OCR_7"/>
             <w:r>
               <w:rPr>
                 <w:rFonts w:ascii="Arial" w:hAnsi="Arial" w:cs="Arial"/>
@@ -473,7 +474,7 @@
               </w:rPr>
               <w:t xml:space="preserve">Mess</w:t>
             </w:r>
-            <w:bookmarkEnd w:id="5"/>
+            <w:bookmarkEnd w:id="7"/>
             <w:r>
               <w:rPr>
                 <w:rFonts w:ascii="Arial" w:hAnsi="Arial" w:cs="Arial"/>
@@ -637,7 +638,7 @@
     <w:p>
       <w:pPr>
         <w:tabs>
-          <w:tab w:val="left" w:pos="1543"/>
+          <w:tab w:val="left" w:pos="1561"/>
           <w:tab w:val="left" w:pos="1918"/>
         </w:tabs>
         <w:spacing w:before="87" w:after="0" w:line="336" w:lineRule="exact"/>
@@ -892,7 +893,7 @@
     <w:p>
       <w:pPr>
         <w:tabs>
-          <w:tab w:val="left" w:pos="1543"/>
+          <w:tab w:val="left" w:pos="1561"/>
           <w:tab w:val="left" w:pos="1918"/>
         </w:tabs>
         <w:spacing w:before="67" w:after="0" w:line="336" w:lineRule="exact"/>
@@ -945,6 +946,7 @@
     <w:p>
       <w:pPr>
         <w:tabs>
+          <w:tab w:val="left" w:pos="1561"/>
           <w:tab w:val="left" w:pos="1918"/>
         </w:tabs>
         <w:spacing w:before="67" w:after="0" w:line="336" w:lineRule="exact"/>
@@ -958,6 +960,24 @@
         </w:rPr>
         <w:t xml:space="preserve">To</w:t>
       </w:r>
+      <w:r>
+        <w:rPr>
+          <w:rFonts w:ascii="Arial" w:hAnsi="Arial" w:cs="Arial"/>
+          <w:sz w:val="28"/>
+          <w:szCs w:val="28"/>
+        </w:rPr>
+        <w:tab/>
+      </w:r>
+      <w:bookmarkStart w:id="4" w:name="_OCR_4"/>
+      <w:r>
+        <w:rPr>
+          <w:rFonts w:ascii="Arial" w:hAnsi="Arial" w:cs="Arial"/>
+          <w:sz w:val="28"/>
+          <w:szCs w:val="28"/>
+        </w:rPr>
+        <w:t xml:space="preserve">:</w:t>
+      </w:r>
+      <w:bookmarkEnd w:id="4"/>
       <w:r>
         <w:rPr>
           <w:rFonts w:ascii="Arial" w:hAnsi="Arial" w:cs="Arial"/>
@@ -1411,23 +1431,42 @@
     </w:p>
     <w:p>
       <w:pPr>
-        <w:spacing w:before="318" w:after="0" w:line="336" w:lineRule="exact"/>
+        <w:spacing w:before="342" w:after="0" w:line="336" w:lineRule="exact"/>
         <w:ind w:left="673" w:right="0"/>
       </w:pPr>
-      <w:bookmarkStart w:id="4" w:name="_OCR_4"/>
-      <w:r>
-        <w:rPr>
-          <w:rFonts w:ascii="Arial" w:hAnsi="Arial" w:cs="Arial"/>
-          <w:sz w:val="28"/>
-          <w:szCs w:val="28"/>
+      <w:bookmarkStart w:id="5" w:name="_OCR_5"/>
+      <w:r>
+        <w:rPr>
+          <w:rFonts w:ascii="Arial" w:hAnsi="Arial" w:cs="Arial"/>
+          <w:sz w:val="28"/>
+          <w:szCs w:val="28"/>
+          <w:u w:val="single"/>
         </w:rPr>
         <w:t xml:space="preserve">Note</w:t>
       </w:r>
-      <w:bookmarkEnd w:id="4"/>
+      <w:bookmarkEnd w:id="5"/>
+      <w:r>
+        <w:rPr>
+          <w:rFonts w:ascii="Arial" w:hAnsi="Arial" w:cs="Arial"/>
+          <w:sz w:val="26"/>
+          <w:szCs w:val="26"/>
+        </w:rPr>
+        <w:t xml:space="preserve"> </w:t>
+      </w:r>
+      <w:bookmarkStart w:id="6" w:name="_OCR_6"/>
+      <w:r>
+        <w:rPr>
+          <w:rFonts w:ascii="Arial" w:hAnsi="Arial" w:cs="Arial"/>
+          <w:sz w:val="28"/>
+          <w:szCs w:val="28"/>
+        </w:rPr>
+        <w:t xml:space="preserve">:</w:t>
+      </w:r>
+      <w:bookmarkEnd w:id="6"/>
     </w:p>
     <w:p>
       <w:pPr>
-        <w:spacing w:before="24" w:after="0" w:line="354" w:lineRule="exact"/>
+        <w:spacing w:before="0" w:after="0" w:line="354" w:lineRule="exact"/>
         <w:ind w:left="686" w:right="0" w:firstLine="17"/>
       </w:pPr>
       <w:r>

</xml_diff>